<commit_message>
Melhoramentos A + fog: fog limpa area visitada e mantem visivel; porta usa modelo 3D por tipo; loot legado (coracao/chave/pocao) removido dos editores e runtime; falas de monstro sem fallback e multiplas por ';'; picareta com slots de mao (perfil+mochila) usando o .glb real (fallback so staff).
</commit_message>
<xml_diff>
--- a/melhoramentos.docx
+++ b/melhoramentos.docx
@@ -20,6 +20,9 @@
     <w:p/>
     <w:p>
       <w:r>
+        <w:rPr>
+          <w:noProof/>
+        </w:rPr>
         <w:drawing>
           <wp:anchor distT="0" distB="0" distL="114300" distR="114300" simplePos="0" relativeHeight="251658240" behindDoc="0" locked="0" layoutInCell="1" allowOverlap="1" wp14:anchorId="3D24A4CA" wp14:editId="10831F5B">
             <wp:simplePos x="0" y="0"/>
@@ -141,6 +144,9 @@
     <w:p/>
     <w:p>
       <w:r>
+        <w:rPr>
+          <w:noProof/>
+        </w:rPr>
         <w:drawing>
           <wp:inline distT="0" distB="0" distL="0" distR="0" wp14:anchorId="24DBBC22" wp14:editId="6B420A03">
             <wp:extent cx="4991777" cy="3284220"/>
@@ -231,6 +237,9 @@
     <w:p/>
     <w:p>
       <w:r>
+        <w:rPr>
+          <w:noProof/>
+        </w:rPr>
         <w:drawing>
           <wp:inline distT="0" distB="0" distL="0" distR="0" wp14:anchorId="0F8B337B" wp14:editId="6604E86A">
             <wp:extent cx="5400040" cy="3076575"/>
@@ -299,6 +308,9 @@
     </w:p>
     <w:p>
       <w:r>
+        <w:rPr>
+          <w:noProof/>
+        </w:rPr>
         <w:lastRenderedPageBreak/>
         <w:drawing>
           <wp:inline distT="0" distB="0" distL="0" distR="0" wp14:anchorId="54F64311" wp14:editId="31D8C20F">
@@ -385,6 +397,9 @@
     <w:p/>
     <w:p>
       <w:r>
+        <w:rPr>
+          <w:noProof/>
+        </w:rPr>
         <w:drawing>
           <wp:inline distT="0" distB="0" distL="0" distR="0" wp14:anchorId="2ED074AB" wp14:editId="512F61BE">
             <wp:extent cx="1234440" cy="1396728"/>
@@ -462,6 +477,9 @@
     </w:p>
     <w:p>
       <w:r>
+        <w:rPr>
+          <w:noProof/>
+        </w:rPr>
         <w:lastRenderedPageBreak/>
         <w:drawing>
           <wp:inline distT="0" distB="0" distL="0" distR="0" wp14:anchorId="759932E3" wp14:editId="0BAA0418">
@@ -545,6 +563,9 @@
     <w:p/>
     <w:p>
       <w:r>
+        <w:rPr>
+          <w:noProof/>
+        </w:rPr>
         <w:drawing>
           <wp:anchor distT="0" distB="0" distL="114300" distR="114300" simplePos="0" relativeHeight="251659264" behindDoc="0" locked="0" layoutInCell="1" allowOverlap="1" wp14:anchorId="1172533F" wp14:editId="5C867EE2">
             <wp:simplePos x="0" y="0"/>
@@ -729,6 +750,9 @@
     <w:p/>
     <w:p>
       <w:r>
+        <w:rPr>
+          <w:noProof/>
+        </w:rPr>
         <w:drawing>
           <wp:anchor distT="0" distB="0" distL="114300" distR="114300" simplePos="0" relativeHeight="251660288" behindDoc="0" locked="0" layoutInCell="1" allowOverlap="1" wp14:anchorId="56D91A5C" wp14:editId="0C4C3A1A">
             <wp:simplePos x="0" y="0"/>
@@ -846,8 +870,11 @@
     <w:p/>
     <w:p>
       <w:r>
+        <w:rPr>
+          <w:noProof/>
+        </w:rPr>
         <w:drawing>
-          <wp:anchor distT="0" distB="0" distL="114300" distR="114300" simplePos="0" relativeHeight="251661312" behindDoc="0" locked="0" layoutInCell="1" allowOverlap="1" wp14:anchorId="3AB33853" wp14:editId="46334597">
+          <wp:anchor distT="0" distB="0" distL="114300" distR="114300" simplePos="0" relativeHeight="251661312" behindDoc="0" locked="0" layoutInCell="1" allowOverlap="1" wp14:anchorId="3AB33853" wp14:editId="79AA65FA">
             <wp:simplePos x="0" y="0"/>
             <wp:positionH relativeFrom="column">
               <wp:posOffset>1905</wp:posOffset>
@@ -1145,10 +1172,528 @@
       </w:r>
     </w:p>
     <w:p/>
+    <w:p>
+      <w:r>
+        <w:lastRenderedPageBreak/>
+        <w:drawing>
+          <wp:inline distT="0" distB="0" distL="0" distR="0" wp14:anchorId="5E93F2CD" wp14:editId="29B8B4DE">
+            <wp:extent cx="5196840" cy="2731031"/>
+            <wp:effectExtent l="0" t="0" r="3810" b="0"/>
+            <wp:docPr id="960807177" name="Imagem 1"/>
+            <wp:cNvGraphicFramePr>
+              <a:graphicFrameLocks xmlns:a="http://schemas.openxmlformats.org/drawingml/2006/main" noChangeAspect="1"/>
+            </wp:cNvGraphicFramePr>
+            <a:graphic xmlns:a="http://schemas.openxmlformats.org/drawingml/2006/main">
+              <a:graphicData uri="http://schemas.openxmlformats.org/drawingml/2006/picture">
+                <pic:pic xmlns:pic="http://schemas.openxmlformats.org/drawingml/2006/picture">
+                  <pic:nvPicPr>
+                    <pic:cNvPr id="960807177" name=""/>
+                    <pic:cNvPicPr/>
+                  </pic:nvPicPr>
+                  <pic:blipFill>
+                    <a:blip r:embed="rId13"/>
+                    <a:stretch>
+                      <a:fillRect/>
+                    </a:stretch>
+                  </pic:blipFill>
+                  <pic:spPr>
+                    <a:xfrm>
+                      <a:off x="0" y="0"/>
+                      <a:ext cx="5209436" cy="2737650"/>
+                    </a:xfrm>
+                    <a:prstGeom prst="rect">
+                      <a:avLst/>
+                    </a:prstGeom>
+                  </pic:spPr>
+                </pic:pic>
+              </a:graphicData>
+            </a:graphic>
+          </wp:inline>
+        </w:drawing>
+      </w:r>
+    </w:p>
     <w:p/>
     <w:p>
       <w:r>
-        <w:t>Além disso, os mapas precisam permitir ter um pouco de cada am</w:t>
+        <w:t>Quando vamos para a edição das missões e entramos n</w:t>
+      </w:r>
+      <w:r>
+        <w:t>as Configurações do Desafio &gt; Mapa, encontramos</w:t>
+      </w:r>
+      <w:r>
+        <w:t xml:space="preserve"> configurações simples para os cenários. Uma delas é para utilizar um cenário disponível e a outra é para criar um mapa procedural.</w:t>
+      </w:r>
+    </w:p>
+    <w:p>
+      <w:r>
+        <w:t xml:space="preserve">Os mapas disponíveis até </w:t>
+      </w:r>
+      <w:r>
+        <w:t xml:space="preserve">são uma boa, pois se você já tiver muitos mapas criados, basta selecionar um. </w:t>
+      </w:r>
+    </w:p>
+    <w:p>
+      <w:r>
+        <w:t xml:space="preserve">Mas criar um mapa procedural atualmente através dessa opção </w:t>
+      </w:r>
+      <w:r>
+        <w:t xml:space="preserve">está um verdadeiro caos. </w:t>
+      </w:r>
+    </w:p>
+    <w:p>
+      <w:r>
+        <w:t>Primeiro que só te deixa definir que</w:t>
+      </w:r>
+      <w:r>
+        <w:t>m</w:t>
+      </w:r>
+      <w:r>
+        <w:t xml:space="preserve"> será o boss da missão. </w:t>
+      </w:r>
+    </w:p>
+    <w:p>
+      <w:r>
+        <w:t>Segundo que não há critérios de quantos monstros vai ter nes</w:t>
+      </w:r>
+      <w:r>
+        <w:t>se cenário gerado e quais serão os monstros possíve</w:t>
+      </w:r>
+      <w:r>
+        <w:t>is</w:t>
+      </w:r>
+      <w:r>
+        <w:t xml:space="preserve">, </w:t>
+      </w:r>
+      <w:r>
+        <w:t xml:space="preserve">nem </w:t>
+      </w:r>
+      <w:r>
+        <w:t>quais serão as recompensas</w:t>
+      </w:r>
+      <w:r>
+        <w:t xml:space="preserve"> do mapa, </w:t>
+      </w:r>
+      <w:r>
+        <w:t xml:space="preserve">ou </w:t>
+      </w:r>
+      <w:r>
+        <w:t>quantas moedas</w:t>
+      </w:r>
+      <w:r>
+        <w:t xml:space="preserve"> no</w:t>
+      </w:r>
+      <w:r>
+        <w:t xml:space="preserve"> total o mapa terá, quantos baús, quantas rochas quebráveis, se o mapa vai ter portas</w:t>
+      </w:r>
+      <w:r>
+        <w:t xml:space="preserve"> e quantas</w:t>
+      </w:r>
+      <w:r>
+        <w:t xml:space="preserve"> serão</w:t>
+      </w:r>
+      <w:r>
+        <w:t>, se vai ter ambientes fechados ou só abertos e por aí vai...</w:t>
+      </w:r>
+    </w:p>
+    <w:p>
+      <w:r>
+        <w:drawing>
+          <wp:inline distT="0" distB="0" distL="0" distR="0" wp14:anchorId="0A127539" wp14:editId="60D37A0E">
+            <wp:extent cx="2712720" cy="952855"/>
+            <wp:effectExtent l="0" t="0" r="0" b="0"/>
+            <wp:docPr id="1804064275" name="Imagem 1"/>
+            <wp:cNvGraphicFramePr>
+              <a:graphicFrameLocks xmlns:a="http://schemas.openxmlformats.org/drawingml/2006/main" noChangeAspect="1"/>
+            </wp:cNvGraphicFramePr>
+            <a:graphic xmlns:a="http://schemas.openxmlformats.org/drawingml/2006/main">
+              <a:graphicData uri="http://schemas.openxmlformats.org/drawingml/2006/picture">
+                <pic:pic xmlns:pic="http://schemas.openxmlformats.org/drawingml/2006/picture">
+                  <pic:nvPicPr>
+                    <pic:cNvPr id="1804064275" name=""/>
+                    <pic:cNvPicPr/>
+                  </pic:nvPicPr>
+                  <pic:blipFill>
+                    <a:blip r:embed="rId14"/>
+                    <a:stretch>
+                      <a:fillRect/>
+                    </a:stretch>
+                  </pic:blipFill>
+                  <pic:spPr>
+                    <a:xfrm>
+                      <a:off x="0" y="0"/>
+                      <a:ext cx="2723241" cy="956550"/>
+                    </a:xfrm>
+                    <a:prstGeom prst="rect">
+                      <a:avLst/>
+                    </a:prstGeom>
+                  </pic:spPr>
+                </pic:pic>
+              </a:graphicData>
+            </a:graphic>
+          </wp:inline>
+        </w:drawing>
+      </w:r>
+    </w:p>
+    <w:p>
+      <w:r>
+        <w:t>Tanto essa opção de geração procedural dentro da edição das missões quanto a geração</w:t>
+      </w:r>
+      <w:r>
+        <w:t xml:space="preserve"> aleatória dentro dos cenários </w:t>
+      </w:r>
+      <w:r>
+        <w:t>precisam</w:t>
+      </w:r>
+      <w:r>
+        <w:t xml:space="preserve"> passar por um refinamento</w:t>
+      </w:r>
+      <w:r>
+        <w:t xml:space="preserve"> para perguntar essas coisas antes de gerar</w:t>
+      </w:r>
+      <w:r>
+        <w:t xml:space="preserve"> um mapa</w:t>
+      </w:r>
+      <w:r>
+        <w:t xml:space="preserve">, senão o jogo pode gerar 1000 monstros fallback (Como acontece hoje) e não há nenhuma chance para </w:t>
+      </w:r>
+      <w:r>
+        <w:t xml:space="preserve">os iniciantes e nem mesmo para o administrador que tem acesso a todos os itens do jogo de sobreviver nos cenários se não </w:t>
+      </w:r>
+      <w:r>
+        <w:t>tiver condições bem definidas.</w:t>
+      </w:r>
+    </w:p>
+    <w:p>
+      <w:r>
+        <w:lastRenderedPageBreak/>
+        <w:drawing>
+          <wp:inline distT="0" distB="0" distL="0" distR="0" wp14:anchorId="626AF22A" wp14:editId="0846F3B0">
+            <wp:extent cx="5370299" cy="2407920"/>
+            <wp:effectExtent l="0" t="0" r="1905" b="0"/>
+            <wp:docPr id="1905184800" name="Imagem 1"/>
+            <wp:cNvGraphicFramePr>
+              <a:graphicFrameLocks xmlns:a="http://schemas.openxmlformats.org/drawingml/2006/main" noChangeAspect="1"/>
+            </wp:cNvGraphicFramePr>
+            <a:graphic xmlns:a="http://schemas.openxmlformats.org/drawingml/2006/main">
+              <a:graphicData uri="http://schemas.openxmlformats.org/drawingml/2006/picture">
+                <pic:pic xmlns:pic="http://schemas.openxmlformats.org/drawingml/2006/picture">
+                  <pic:nvPicPr>
+                    <pic:cNvPr id="1905184800" name=""/>
+                    <pic:cNvPicPr/>
+                  </pic:nvPicPr>
+                  <pic:blipFill>
+                    <a:blip r:embed="rId15"/>
+                    <a:stretch>
+                      <a:fillRect/>
+                    </a:stretch>
+                  </pic:blipFill>
+                  <pic:spPr>
+                    <a:xfrm>
+                      <a:off x="0" y="0"/>
+                      <a:ext cx="5386778" cy="2415309"/>
+                    </a:xfrm>
+                    <a:prstGeom prst="rect">
+                      <a:avLst/>
+                    </a:prstGeom>
+                  </pic:spPr>
+                </pic:pic>
+              </a:graphicData>
+            </a:graphic>
+          </wp:inline>
+        </w:drawing>
+      </w:r>
+    </w:p>
+    <w:p>
+      <w:r>
+        <w:t xml:space="preserve">Veja que </w:t>
+      </w:r>
+      <w:r>
+        <w:t>é impossível sobreviver a um cenário sem critérios.</w:t>
+      </w:r>
+    </w:p>
+    <w:p/>
+    <w:p/>
+    <w:p>
+      <w:r>
+        <w:drawing>
+          <wp:inline distT="0" distB="0" distL="0" distR="0" wp14:anchorId="487077EA" wp14:editId="1DB52972">
+            <wp:extent cx="2295845" cy="819264"/>
+            <wp:effectExtent l="0" t="0" r="9525" b="0"/>
+            <wp:docPr id="1009187648" name="Imagem 1"/>
+            <wp:cNvGraphicFramePr>
+              <a:graphicFrameLocks xmlns:a="http://schemas.openxmlformats.org/drawingml/2006/main" noChangeAspect="1"/>
+            </wp:cNvGraphicFramePr>
+            <a:graphic xmlns:a="http://schemas.openxmlformats.org/drawingml/2006/main">
+              <a:graphicData uri="http://schemas.openxmlformats.org/drawingml/2006/picture">
+                <pic:pic xmlns:pic="http://schemas.openxmlformats.org/drawingml/2006/picture">
+                  <pic:nvPicPr>
+                    <pic:cNvPr id="1009187648" name=""/>
+                    <pic:cNvPicPr/>
+                  </pic:nvPicPr>
+                  <pic:blipFill>
+                    <a:blip r:embed="rId16"/>
+                    <a:stretch>
+                      <a:fillRect/>
+                    </a:stretch>
+                  </pic:blipFill>
+                  <pic:spPr>
+                    <a:xfrm>
+                      <a:off x="0" y="0"/>
+                      <a:ext cx="2295845" cy="819264"/>
+                    </a:xfrm>
+                    <a:prstGeom prst="rect">
+                      <a:avLst/>
+                    </a:prstGeom>
+                  </pic:spPr>
+                </pic:pic>
+              </a:graphicData>
+            </a:graphic>
+          </wp:inline>
+        </w:drawing>
+      </w:r>
+      <w:r>
+        <w:drawing>
+          <wp:inline distT="0" distB="0" distL="0" distR="0" wp14:anchorId="6ACFF52A" wp14:editId="46FD372E">
+            <wp:extent cx="2162477" cy="876422"/>
+            <wp:effectExtent l="0" t="0" r="9525" b="0"/>
+            <wp:docPr id="1470985938" name="Imagem 1"/>
+            <wp:cNvGraphicFramePr>
+              <a:graphicFrameLocks xmlns:a="http://schemas.openxmlformats.org/drawingml/2006/main" noChangeAspect="1"/>
+            </wp:cNvGraphicFramePr>
+            <a:graphic xmlns:a="http://schemas.openxmlformats.org/drawingml/2006/main">
+              <a:graphicData uri="http://schemas.openxmlformats.org/drawingml/2006/picture">
+                <pic:pic xmlns:pic="http://schemas.openxmlformats.org/drawingml/2006/picture">
+                  <pic:nvPicPr>
+                    <pic:cNvPr id="1470985938" name=""/>
+                    <pic:cNvPicPr/>
+                  </pic:nvPicPr>
+                  <pic:blipFill>
+                    <a:blip r:embed="rId17"/>
+                    <a:stretch>
+                      <a:fillRect/>
+                    </a:stretch>
+                  </pic:blipFill>
+                  <pic:spPr>
+                    <a:xfrm>
+                      <a:off x="0" y="0"/>
+                      <a:ext cx="2162477" cy="876422"/>
+                    </a:xfrm>
+                    <a:prstGeom prst="rect">
+                      <a:avLst/>
+                    </a:prstGeom>
+                  </pic:spPr>
+                </pic:pic>
+              </a:graphicData>
+            </a:graphic>
+          </wp:inline>
+        </w:drawing>
+      </w:r>
+    </w:p>
+    <w:p/>
+    <w:p>
+      <w:r>
+        <w:t>Picareta nos cenários.</w:t>
+      </w:r>
+    </w:p>
+    <w:p>
+      <w:r>
+        <w:t xml:space="preserve">Atualmente é bem </w:t>
+      </w:r>
+      <w:r>
+        <w:t>estranho apenas termos uma opção no hud do jogo despadronizada</w:t>
+      </w:r>
+      <w:r>
+        <w:t xml:space="preserve"> com o restante dele. Essa picareta deveria ser equipada a um slot</w:t>
+      </w:r>
+      <w:r>
+        <w:t xml:space="preserve"> de equipamentos de mão dentro dos cenários </w:t>
+      </w:r>
+      <w:r>
+        <w:t xml:space="preserve">e não ficar </w:t>
+      </w:r>
+      <w:r>
+        <w:t xml:space="preserve">como uma opção </w:t>
+      </w:r>
+      <w:r>
+        <w:t>fix</w:t>
+      </w:r>
+      <w:r>
+        <w:t>a e sem graça.</w:t>
+      </w:r>
+      <w:r>
+        <w:t xml:space="preserve"> Da mesma forma que temos os slots para itens consumíveis poderíamos ter slots dos equipamentos de mão</w:t>
+      </w:r>
+      <w:r>
+        <w:t xml:space="preserve"> do personagem, permitindo o jogador possa </w:t>
+      </w:r>
+      <w:r>
+        <w:t xml:space="preserve">equipar a picareta com a tecla P, e ela seria equipada aos </w:t>
+      </w:r>
+      <w:r>
+        <w:t xml:space="preserve">2 </w:t>
+      </w:r>
+      <w:r>
+        <w:t>slots de mão disponíveis</w:t>
+      </w:r>
+      <w:r>
+        <w:t xml:space="preserve"> ou então voltar a utilizar o equipamento que já estava equipado antes. </w:t>
+      </w:r>
+    </w:p>
+    <w:p>
+      <w:r>
+        <w:t>Além disso, a renderização da animação não pode ficar se baseando em fallback quando o jogador tem um item</w:t>
+      </w:r>
+      <w:r>
+        <w:t xml:space="preserve"> .glb configurado e equipado, a renderização precisa utilizar exatamente o arquivo .glb que está equipado no momento, inclusive para os administradores, professores etc.</w:t>
+      </w:r>
+      <w:r>
+        <w:t xml:space="preserve"> Atualmente, para qualquer usuário do sistema a renderização da picareta é o fallback. O fallback só serve para o administrador quando ele não possui realmente nenhum item de picareta no seu inventário</w:t>
+      </w:r>
+      <w:r>
+        <w:t>. Esse fallback é uma opção de debug e não pode substituir as opções reais do jogo. Jogadores nunca, em hipótese alguma, podem utilizar a picareta fallback</w:t>
+      </w:r>
+      <w:r>
+        <w:t xml:space="preserve"> e administradores e professores só utilizarão explicitamente </w:t>
+      </w:r>
+      <w:r>
+        <w:lastRenderedPageBreak/>
+        <w:t>quando uma picareta não estiver disponível em sua mochila, caso contrário, utilize uma picareta disponível e equipe-a antes de usar.</w:t>
+      </w:r>
+    </w:p>
+    <w:p/>
+    <w:p>
+      <w:r>
+        <w:drawing>
+          <wp:inline distT="0" distB="0" distL="0" distR="0" wp14:anchorId="4CA43504" wp14:editId="77CF02CA">
+            <wp:extent cx="3642360" cy="2638398"/>
+            <wp:effectExtent l="0" t="0" r="0" b="0"/>
+            <wp:docPr id="530694241" name="Imagem 1"/>
+            <wp:cNvGraphicFramePr>
+              <a:graphicFrameLocks xmlns:a="http://schemas.openxmlformats.org/drawingml/2006/main" noChangeAspect="1"/>
+            </wp:cNvGraphicFramePr>
+            <a:graphic xmlns:a="http://schemas.openxmlformats.org/drawingml/2006/main">
+              <a:graphicData uri="http://schemas.openxmlformats.org/drawingml/2006/picture">
+                <pic:pic xmlns:pic="http://schemas.openxmlformats.org/drawingml/2006/picture">
+                  <pic:nvPicPr>
+                    <pic:cNvPr id="530694241" name=""/>
+                    <pic:cNvPicPr/>
+                  </pic:nvPicPr>
+                  <pic:blipFill>
+                    <a:blip r:embed="rId18"/>
+                    <a:stretch>
+                      <a:fillRect/>
+                    </a:stretch>
+                  </pic:blipFill>
+                  <pic:spPr>
+                    <a:xfrm>
+                      <a:off x="0" y="0"/>
+                      <a:ext cx="3647937" cy="2642438"/>
+                    </a:xfrm>
+                    <a:prstGeom prst="rect">
+                      <a:avLst/>
+                    </a:prstGeom>
+                  </pic:spPr>
+                </pic:pic>
+              </a:graphicData>
+            </a:graphic>
+          </wp:inline>
+        </w:drawing>
+      </w:r>
+    </w:p>
+    <w:p>
+      <w:r>
+        <w:t xml:space="preserve">Fog: </w:t>
+      </w:r>
+    </w:p>
+    <w:p>
+      <w:r>
+        <w:t xml:space="preserve">Esse fog persistente no cenário, mesmo que o jogador já tenha passado pela área, é irritante. </w:t>
+      </w:r>
+      <w:r>
+        <w:t>Tem áreas que você passa mais de uma vez por ela e o fog nunca sai.</w:t>
+      </w:r>
+    </w:p>
+    <w:p>
+      <w:r>
+        <w:t xml:space="preserve">Logo no início isso era melhor, mas a medida que as coisas foram sendo implementadas e mudadas no jogo, </w:t>
+      </w:r>
+      <w:r>
+        <w:t>acabou ficando ruim. Dê uma olhada no github logo na primeira vez que o fog foi implementado. O código que era usado no começo era muito melhor do que o atual.</w:t>
+      </w:r>
+    </w:p>
+    <w:p/>
+    <w:p>
+      <w:r>
+        <w:drawing>
+          <wp:inline distT="0" distB="0" distL="0" distR="0" wp14:anchorId="3023B8B6" wp14:editId="3355428D">
+            <wp:extent cx="4229100" cy="1899713"/>
+            <wp:effectExtent l="0" t="0" r="0" b="5715"/>
+            <wp:docPr id="324520794" name="Imagem 1"/>
+            <wp:cNvGraphicFramePr>
+              <a:graphicFrameLocks xmlns:a="http://schemas.openxmlformats.org/drawingml/2006/main" noChangeAspect="1"/>
+            </wp:cNvGraphicFramePr>
+            <a:graphic xmlns:a="http://schemas.openxmlformats.org/drawingml/2006/main">
+              <a:graphicData uri="http://schemas.openxmlformats.org/drawingml/2006/picture">
+                <pic:pic xmlns:pic="http://schemas.openxmlformats.org/drawingml/2006/picture">
+                  <pic:nvPicPr>
+                    <pic:cNvPr id="324520794" name=""/>
+                    <pic:cNvPicPr/>
+                  </pic:nvPicPr>
+                  <pic:blipFill>
+                    <a:blip r:embed="rId19"/>
+                    <a:stretch>
+                      <a:fillRect/>
+                    </a:stretch>
+                  </pic:blipFill>
+                  <pic:spPr>
+                    <a:xfrm>
+                      <a:off x="0" y="0"/>
+                      <a:ext cx="4261253" cy="1914156"/>
+                    </a:xfrm>
+                    <a:prstGeom prst="rect">
+                      <a:avLst/>
+                    </a:prstGeom>
+                  </pic:spPr>
+                </pic:pic>
+              </a:graphicData>
+            </a:graphic>
+          </wp:inline>
+        </w:drawing>
+      </w:r>
+    </w:p>
+    <w:p>
+      <w:r>
+        <w:t>Cenários</w:t>
+      </w:r>
+      <w:r>
+        <w:t xml:space="preserve"> desorganizados, sem critérios, sem ambientes atrativos</w:t>
+      </w:r>
+      <w:r>
+        <w:t>, apenas blocos</w:t>
+      </w:r>
+      <w:r>
+        <w:t xml:space="preserve"> fechando o caminho</w:t>
+      </w:r>
+      <w:r>
+        <w:t xml:space="preserve">, </w:t>
+      </w:r>
+      <w:r>
+        <w:t>ao invés de um ambiente bem planejado</w:t>
+      </w:r>
+      <w:r>
+        <w:t>, com</w:t>
+      </w:r>
+      <w:r>
+        <w:t xml:space="preserve"> </w:t>
+      </w:r>
+      <w:r>
+        <w:t xml:space="preserve">divisões bem estruturadas, </w:t>
+      </w:r>
+      <w:r>
+        <w:t xml:space="preserve">mobs por área, paisagens marcantes, </w:t>
+      </w:r>
+      <w:r>
+        <w:t>puzzles inteligentes etc.</w:t>
       </w:r>
     </w:p>
     <w:sectPr>

</xml_diff>